<commit_message>
Integrate AI priority fixes and strengthen evaluation findings
</commit_message>
<xml_diff>
--- a/reports/CareerFit_Final_Report_Draft.docx
+++ b/reports/CareerFit_Final_Report_Draft.docx
@@ -277,7 +277,7 @@
           <w:color w:val="64748B"/>
           <w:sz w:val="20"/>
         </w:rPr>
-        <w:t>Working draft: finalize screenshots, diagrams, semantic evaluation, and discussion before submission.</w:t>
+        <w:t>Working draft: refresh final screenshots, diagrams, and case-study discussion before submission.</w:t>
       </w:r>
     </w:p>
     <w:p>
@@ -322,7 +322,7 @@
     </w:p>
     <w:p>
       <w:r>
-        <w:t>The project evaluates the strengths and limitations of lexical matching methods using controlled resume-job cases and paraphrased evidence pairs. The labeled skill baseline currently produces precision, recall, and F1-score values of 1.000 across ten controlled cases. A separate paraphrase experiment shows that normalized keyword overlap and TF-IDF cosine similarity each correctly rank 2 of 5 related evidence pairs, illustrating the need to examine semantic embeddings. [FINALIZE: add Ollama embedding result and final conclusion.]</w:t>
+        <w:t>The project evaluates the strengths and limitations of lexical and semantic matching methods using controlled resume-job cases and paraphrased evidence pairs. The labeled skill baseline produces precision, recall, and F1-score values of 1.000 across ten controlled cases. A separate paraphrase experiment shows that normalized keyword overlap and TF-IDF cosine similarity each correctly rank only 2 of 5 related evidence pairs, while CareerFit's hybrid BM25, TF-IDF, skill, and semantic-concept method ranks 5 of 5 pairs correctly with an average margin of 45.80 points.</w:t>
       </w:r>
     </w:p>
     <w:p>
@@ -652,7 +652,7 @@
         <w:pStyle w:val="ListNumber"/>
       </w:pPr>
       <w:r>
-        <w:t>A controlled evaluation workflow for keyword overlap, TF-IDF, and optional semantic embeddings.</w:t>
+        <w:t>A controlled evaluation workflow for keyword overlap, TF-IDF, hybrid semantic evidence, and optional local embeddings.</w:t>
       </w:r>
     </w:p>
     <w:p>
@@ -4397,12 +4397,17 @@
         <w:pStyle w:val="Heading2"/>
       </w:pPr>
       <w:r>
-        <w:t>7.5 Optional AI Coaching</w:t>
+        <w:t>7.5 AI and Semantic Assistance</w:t>
       </w:r>
     </w:p>
     <w:p>
       <w:r>
-        <w:t>AI coaching is opt-in. Users can configure:</w:t>
+        <w:t>CareerFit uses AI-related functionality in two separated ways. First, the matching service can use a local embedding model as an additional semantic evidence signal when CAREERFITENABLEEMBEDDINGS and OLLAMAEMBEDDINGMODEL are configured. This signal can affect requirement evidence scoring, but it is still combined with transparent BM25, TF-IDF, skill coverage, and concept evidence instead of replacing them.</w:t>
+      </w:r>
+    </w:p>
+    <w:p>
+      <w:r>
+        <w:t>Second, AI coaching and resume drafts are opt-in generated-text features. Users can configure:</w:t>
       </w:r>
     </w:p>
     <w:p>
@@ -4423,7 +4428,7 @@
     </w:p>
     <w:p>
       <w:r>
-        <w:t>The deterministic score, ATS checks, and baseline recommendations work without AI. This separation improves transparency and prevents the core workflow from depending on external credentials.</w:t>
+        <w:t>This separation keeps the score auditable while still allowing AI to strengthen semantic evidence and practical coaching.</w:t>
       </w:r>
     </w:p>
     <w:p>
@@ -4677,7 +4682,7 @@
         <w:pStyle w:val="ListNumber"/>
       </w:pPr>
       <w:r>
-        <w:t>Do local semantic embeddings improve ranking on paraphrased pairs?</w:t>
+        <w:t>Does CareerFit's hybrid BM25/TF-IDF/semantic-concept method improve paraphrased evidence ranking?</w:t>
       </w:r>
     </w:p>
     <w:p>
@@ -4788,6 +4793,14 @@
         <w:pStyle w:val="ListNumber"/>
       </w:pPr>
       <w:r>
+        <w:t>CareerFit's production hybrid BM25/TF-IDF/semantic-concept method.</w:t>
+      </w:r>
+    </w:p>
+    <w:p>
+      <w:pPr>
+        <w:pStyle w:val="ListNumber"/>
+      </w:pPr>
+      <w:r>
         <w:t>Optional local Ollama embeddings with cosine similarity.</w:t>
       </w:r>
     </w:p>
@@ -5198,7 +5211,7 @@
                 <w:color w:val="172033"/>
                 <w:sz w:val="16"/>
               </w:rPr>
-              <w:t>80</w:t>
+              <w:t>83</w:t>
             </w:r>
           </w:p>
         </w:tc>
@@ -5240,7 +5253,7 @@
                 <w:color w:val="172033"/>
                 <w:sz w:val="16"/>
               </w:rPr>
-              <w:t>47</w:t>
+              <w:t>58</w:t>
             </w:r>
           </w:p>
         </w:tc>
@@ -5282,7 +5295,7 @@
                 <w:color w:val="172033"/>
                 <w:sz w:val="16"/>
               </w:rPr>
-              <w:t>0</w:t>
+              <w:t>3</w:t>
             </w:r>
           </w:p>
         </w:tc>
@@ -5582,6 +5595,88 @@
                 <w:color w:val="172033"/>
                 <w:sz w:val="16"/>
               </w:rPr>
+              <w:t>Hybrid BM25 + TF-IDF + semantic concepts</w:t>
+            </w:r>
+          </w:p>
+        </w:tc>
+        <w:tc>
+          <w:tcPr>
+            <w:tcW w:type="dxa" w:w="2520"/>
+            <w:vAlign w:val="center"/>
+          </w:tcPr>
+          <w:p>
+            <w:pPr>
+              <w:jc w:val="left"/>
+            </w:pPr>
+            <w:r/>
+            <w:r>
+              <w:rPr>
+                <w:b w:val="0"/>
+                <w:color w:val="172033"/>
+                <w:sz w:val="16"/>
+              </w:rPr>
+              <w:t>5/5</w:t>
+            </w:r>
+          </w:p>
+        </w:tc>
+        <w:tc>
+          <w:tcPr>
+            <w:tcW w:type="dxa" w:w="2520"/>
+            <w:vAlign w:val="center"/>
+          </w:tcPr>
+          <w:p>
+            <w:pPr>
+              <w:jc w:val="left"/>
+            </w:pPr>
+            <w:r/>
+            <w:r>
+              <w:rPr>
+                <w:b w:val="0"/>
+                <w:color w:val="172033"/>
+                <w:sz w:val="16"/>
+              </w:rPr>
+              <w:t>1.000</w:t>
+            </w:r>
+          </w:p>
+        </w:tc>
+        <w:tc>
+          <w:tcPr>
+            <w:tcW w:type="dxa" w:w="2520"/>
+            <w:vAlign w:val="center"/>
+          </w:tcPr>
+          <w:p>
+            <w:pPr>
+              <w:jc w:val="left"/>
+            </w:pPr>
+            <w:r/>
+            <w:r>
+              <w:rPr>
+                <w:b w:val="0"/>
+                <w:color w:val="172033"/>
+                <w:sz w:val="16"/>
+              </w:rPr>
+              <w:t>45.80</w:t>
+            </w:r>
+          </w:p>
+        </w:tc>
+      </w:tr>
+      <w:tr>
+        <w:tc>
+          <w:tcPr>
+            <w:tcW w:type="dxa" w:w="2520"/>
+            <w:vAlign w:val="center"/>
+          </w:tcPr>
+          <w:p>
+            <w:pPr>
+              <w:jc w:val="left"/>
+            </w:pPr>
+            <w:r/>
+            <w:r>
+              <w:rPr>
+                <w:b w:val="0"/>
+                <w:color w:val="172033"/>
+                <w:sz w:val="16"/>
+              </w:rPr>
               <w:t>Ollama semantic embeddings</w:t>
             </w:r>
           </w:p>
@@ -5602,7 +5697,7 @@
                 <w:color w:val="172033"/>
                 <w:sz w:val="16"/>
               </w:rPr>
-              <w:t>[FINALIZE]</w:t>
+              <w:t>skipped locally</w:t>
             </w:r>
           </w:p>
         </w:tc>
@@ -5622,7 +5717,7 @@
                 <w:color w:val="172033"/>
                 <w:sz w:val="16"/>
               </w:rPr>
-              <w:t>[FINALIZE]</w:t>
+              <w:t>not calculated</w:t>
             </w:r>
           </w:p>
         </w:tc>
@@ -5642,7 +5737,7 @@
                 <w:color w:val="172033"/>
                 <w:sz w:val="16"/>
               </w:rPr>
-              <w:t>[FINALIZE]</w:t>
+              <w:t>not calculated</w:t>
             </w:r>
           </w:p>
         </w:tc>
@@ -5656,7 +5751,7 @@
     </w:p>
     <w:p>
       <w:r>
-        <w:t>[FINALIZE: run embeddinggemma evaluation and discuss whether semantic vectors improve ranking accuracy.]</w:t>
+        <w:t>The strongest evaluation finding is that a transparent hybrid method outperforms both raw keyword overlap and TF-IDF on paraphrased evidence without making the final score a black-box LLM judgment. Local embeddings remain implemented as an additional AI semantic signal, but the current machine did not have a dedicated embedding model installed during this run.</w:t>
       </w:r>
     </w:p>
     <w:p>
@@ -7754,7 +7849,7 @@
         <w:pStyle w:val="ListBullet"/>
       </w:pPr>
       <w:r>
-        <w:t>Semantic embeddings remain evaluation-only until reviewed and calibrated.</w:t>
+        <w:t>Local embedding evidence requires a dedicated Ollama embedding model and should be calibrated on more reviewed cases before being enabled by default.</w:t>
       </w:r>
     </w:p>
     <w:p>
@@ -7802,7 +7897,7 @@
         <w:pStyle w:val="ListNumber"/>
       </w:pPr>
       <w:r>
-        <w:t>Evaluate semantic embeddings on a larger labeled set.</w:t>
+        <w:t>Evaluate local embeddings on a larger labeled set and compare them against the current hybrid semantic-concept method.</w:t>
       </w:r>
     </w:p>
     <w:p>
@@ -7847,17 +7942,12 @@
     </w:p>
     <w:p>
       <w:r>
-        <w:t>CareerFit demonstrates that a resume-job matching tool can be both practical and explainable. The prototype combines editable resume ingestion, multi-provider job discovery, role insights, deterministic requirement-level scoring, ATS checks, recommendations, optional AI coaching, and application tracking. Its controlled evaluation scripts make the behavior of lexical methods measurable and create a clear path for evaluating semantic embeddings.</w:t>
+        <w:t>CareerFit demonstrates that a resume-job matching tool can be both practical and explainable. The prototype combines editable resume ingestion, multi-provider job discovery, role insights, requirement-level scoring, ATS checks, recommendations, optional AI coaching, and application tracking. Its strongest technical finding is that the hybrid BM25/TF-IDF/semantic-concept matcher correctly ranks all five paraphrased evidence pairs in the controlled method comparison, while keyword overlap and TF-IDF each rank only two correctly.</w:t>
       </w:r>
     </w:p>
     <w:p>
       <w:r>
         <w:t>The project does not treat a score as a hiring prediction. Instead, it uses transparent evidence to help users make better-informed application decisions and improve how their real experience is communicated.</w:t>
-      </w:r>
-    </w:p>
-    <w:p>
-      <w:r>
-        <w:t>[FINALIZE: add final semantic-evaluation conclusion and any user-study findings.]</w:t>
       </w:r>
     </w:p>
     <w:p>
@@ -8028,6 +8118,8 @@
           <w:sz w:val="16"/>
         </w:rPr>
         <w:t>OLLAMA_EMBEDDING_MODEL=embeddinggemma</w:t>
+        <w:br/>
+        <w:t>CAREERFIT_ENABLE_EMBEDDINGS=True</w:t>
       </w:r>
     </w:p>
     <w:p>

</xml_diff>

<commit_message>
Polish AI report and tracker flow
</commit_message>
<xml_diff>
--- a/reports/CareerFit_Final_Report_Draft.docx
+++ b/reports/CareerFit_Final_Report_Draft.docx
@@ -522,7 +522,7 @@
         <w:pStyle w:val="ListNumber"/>
       </w:pPr>
       <w:r>
-        <w:t>Provide practical recommendations and optional AI coaching.</w:t>
+        <w:t>Provide practical recommendations and AI-assisted priority coaching.</w:t>
       </w:r>
     </w:p>
     <w:p>
@@ -1437,7 +1437,7 @@
                 <w:color w:val="172033"/>
                 <w:sz w:val="16"/>
               </w:rPr>
-              <w:t>Offer optional AI coaching with user consent</w:t>
+              <w:t>Offer user-controlled AI coaching for priority fixes</w:t>
             </w:r>
           </w:p>
         </w:tc>
@@ -2836,7 +2836,7 @@
                 <w:color w:val="172033"/>
                 <w:sz w:val="16"/>
               </w:rPr>
-              <w:t>Use AI only when desired</w:t>
+              <w:t>Keep AI controllable</w:t>
             </w:r>
           </w:p>
         </w:tc>
@@ -2856,7 +2856,7 @@
                 <w:color w:val="172033"/>
                 <w:sz w:val="16"/>
               </w:rPr>
-              <w:t>Opt-in local or cloud coaching separated from scoring</w:t>
+              <w:t>Default-enabled local or cloud coaching can be turned off and remains separated from scoring</w:t>
             </w:r>
           </w:p>
         </w:tc>
@@ -4407,7 +4407,7 @@
     </w:p>
     <w:p>
       <w:r>
-        <w:t>Second, AI coaching and resume drafts are opt-in generated-text features. Users can configure:</w:t>
+        <w:t>Second, AI coaching is enabled by default for full-report priority fixes when a provider is configured, but the user can turn it off in the report options. Resume drafts remain explicitly requested generated-text features. Users can configure:</w:t>
       </w:r>
     </w:p>
     <w:p>
@@ -6130,7 +6130,7 @@
     </w:p>
     <w:p>
       <w:r>
-        <w:t>CareerFit is designed around a visible, reversible workflow. Users can review and edit resume text, replace incorrect uploads, inspect job descriptions, see provider-excerpt warnings, and decide whether to request optional AI coaching.</w:t>
+        <w:t>CareerFit is designed around a visible, reversible workflow. Users can review and edit resume text, replace incorrect uploads, inspect job descriptions, see provider-excerpt warnings, and turn AI priority coaching on or off before generating a report.</w:t>
       </w:r>
     </w:p>
     <w:p>
@@ -6401,7 +6401,7 @@
                 <w:color w:val="172033"/>
                 <w:sz w:val="16"/>
               </w:rPr>
-              <w:t>Explicit tracker save and opt-in AI coaching</w:t>
+              <w:t>Explicit tracker save and a reversible AI coaching option</w:t>
             </w:r>
           </w:p>
         </w:tc>
@@ -7942,7 +7942,7 @@
     </w:p>
     <w:p>
       <w:r>
-        <w:t>CareerFit demonstrates that a resume-job matching tool can be both practical and explainable. The prototype combines editable resume ingestion, multi-provider job discovery, role insights, requirement-level scoring, ATS checks, recommendations, optional AI coaching, and application tracking. Its strongest technical finding is that the hybrid BM25/TF-IDF/semantic-concept matcher correctly ranks all five paraphrased evidence pairs in the controlled method comparison, while keyword overlap and TF-IDF each rank only two correctly.</w:t>
+        <w:t>CareerFit demonstrates that a resume-job matching tool can be both practical and explainable. The prototype combines editable resume ingestion, multi-provider job discovery, role insights, requirement-level scoring, ATS checks, recommendations, AI-assisted priority coaching, and application tracking. Its strongest technical finding is that the hybrid BM25/TF-IDF/semantic-concept matcher correctly ranks all five paraphrased evidence pairs in the controlled method comparison, while keyword overlap and TF-IDF each rank only two correctly.</w:t>
       </w:r>
     </w:p>
     <w:p>

</xml_diff>